<commit_message>
Update Doc. Funcional corregido.docx
</commit_message>
<xml_diff>
--- a/Doc. Funcional corregido.docx
+++ b/Doc. Funcional corregido.docx
@@ -2840,67 +2840,21 @@
         </w:rPr>
         <w:t xml:space="preserve">El propósito del proyecto es automatizar el envío de </w:t>
       </w:r>
-      <w:proofErr w:type="spellStart"/>
       <w:r>
         <w:rPr>
           <w:rFonts w:ascii="Arial" w:hAnsi="Arial" w:cs="Arial"/>
           <w:sz w:val="20"/>
           <w:szCs w:val="20"/>
         </w:rPr>
-        <w:t>COAs</w:t>
-      </w:r>
-      <w:proofErr w:type="spellEnd"/>
+        <w:t>COAs, informes de ensayo e Invoice asociados al cliente Riverside</w:t>
+      </w:r>
       <w:r>
         <w:rPr>
           <w:rFonts w:ascii="Arial" w:hAnsi="Arial" w:cs="Arial"/>
           <w:sz w:val="20"/>
           <w:szCs w:val="20"/>
         </w:rPr>
-        <w:t xml:space="preserve">, informes de ensayo e </w:t>
-      </w:r>
-      <w:proofErr w:type="spellStart"/>
-      <w:r>
-        <w:rPr>
-          <w:rFonts w:ascii="Arial" w:hAnsi="Arial" w:cs="Arial"/>
-          <w:sz w:val="20"/>
-          <w:szCs w:val="20"/>
-        </w:rPr>
-        <w:t>Invoice</w:t>
-      </w:r>
-      <w:proofErr w:type="spellEnd"/>
-      <w:r>
-        <w:rPr>
-          <w:rFonts w:ascii="Arial" w:hAnsi="Arial" w:cs="Arial"/>
-          <w:sz w:val="20"/>
-          <w:szCs w:val="20"/>
-        </w:rPr>
-        <w:t xml:space="preserve"> asociados al cliente Riverside</w:t>
-      </w:r>
-      <w:r>
-        <w:rPr>
-          <w:rFonts w:ascii="Arial" w:hAnsi="Arial" w:cs="Arial"/>
-          <w:sz w:val="20"/>
-          <w:szCs w:val="20"/>
-        </w:rPr>
-        <w:t xml:space="preserve">, mediante la implementación de un RPA desarrollado en </w:t>
-      </w:r>
-      <w:proofErr w:type="spellStart"/>
-      <w:r>
-        <w:rPr>
-          <w:rFonts w:ascii="Arial" w:hAnsi="Arial" w:cs="Arial"/>
-          <w:sz w:val="20"/>
-          <w:szCs w:val="20"/>
-        </w:rPr>
-        <w:t>Rocketbot</w:t>
-      </w:r>
-      <w:proofErr w:type="spellEnd"/>
-      <w:r>
-        <w:rPr>
-          <w:rFonts w:ascii="Arial" w:hAnsi="Arial" w:cs="Arial"/>
-          <w:sz w:val="20"/>
-          <w:szCs w:val="20"/>
-        </w:rPr>
-        <w:t>. Esta automatización busca reemplazar el proceso manual actual, reduciendo riesgos operativos, errores humanos y reprocesos, así como asegurando la oportunidad, trazabilidad y consistencia en las comunicaciones con los clientes. El proyecto se alinea con la estrategia de digitalización y mejora continua de los procesos administrativos y de comercio exterior.</w:t>
+        <w:t>, mediante la implementación de un RPA desarrollado en Rocketbot. Esta automatización busca reemplazar el proceso manual actual, reduciendo riesgos operativos, errores humanos y reprocesos, así como asegurando la oportunidad, trazabilidad y consistencia en las comunicaciones con los clientes. El proyecto se alinea con la estrategia de digitalización y mejora continua de los procesos administrativos y de comercio exterior.</w:t>
       </w:r>
     </w:p>
     <w:p>
@@ -2962,25 +2916,7 @@
           <w:sz w:val="20"/>
           <w:szCs w:val="20"/>
         </w:rPr>
-        <w:t xml:space="preserve"> de forma automática, a partir de documentos previamente generados y almacenados en las carpetas definidas. El </w:t>
-      </w:r>
-      <w:proofErr w:type="spellStart"/>
-      <w:r>
-        <w:rPr>
-          <w:rFonts w:ascii="Arial" w:hAnsi="Arial" w:cs="Arial"/>
-          <w:sz w:val="20"/>
-          <w:szCs w:val="20"/>
-        </w:rPr>
-        <w:t>bot</w:t>
-      </w:r>
-      <w:proofErr w:type="spellEnd"/>
-      <w:r>
-        <w:rPr>
-          <w:rFonts w:ascii="Arial" w:hAnsi="Arial" w:cs="Arial"/>
-          <w:sz w:val="20"/>
-          <w:szCs w:val="20"/>
-        </w:rPr>
-        <w:t xml:space="preserve"> validará la existencia de los archivos requeridos, preparará el correo bajo un formato estándar, adjuntará la documentación correspondiente y realizará el envío a los destinatarios configurados, dejando registro del resultado de la operación. El proyecto no contempla la generación ni modificación de las facturas en los sistemas transaccionales, ni cambios al flujo de aprobación previo, limitándose exclusivamente a la automatización del envío de correos conforme al proceso actual.</w:t>
+        <w:t xml:space="preserve"> de forma automática, a partir de documentos previamente generados y almacenados en las carpetas definidas. El bot validará la existencia de los archivos requeridos, preparará el correo bajo un formato estándar, adjuntará la documentación correspondiente y realizará el envío a los destinatarios configurados, dejando registro del resultado de la operación. El proyecto no contempla la generación ni modificación de las facturas en los sistemas transaccionales, ni cambios al flujo de aprobación previo, limitándose exclusivamente a la automatización del envío de correos conforme al proceso actual.</w:t>
       </w:r>
     </w:p>
     <w:p>
@@ -3062,23 +2998,13 @@
           <w:szCs w:val="20"/>
         </w:rPr>
       </w:pPr>
-      <w:proofErr w:type="spellStart"/>
       <w:r>
         <w:rPr>
           <w:rFonts w:ascii="Arial" w:hAnsi="Arial" w:cs="Arial"/>
           <w:sz w:val="20"/>
           <w:szCs w:val="20"/>
         </w:rPr>
-        <w:t>COAs</w:t>
-      </w:r>
-      <w:proofErr w:type="spellEnd"/>
-      <w:r>
-        <w:rPr>
-          <w:rFonts w:ascii="Arial" w:hAnsi="Arial" w:cs="Arial"/>
-          <w:sz w:val="20"/>
-          <w:szCs w:val="20"/>
-        </w:rPr>
-        <w:t>: Certificados de calidad</w:t>
+        <w:t>COAs: Certificados de calidad</w:t>
       </w:r>
     </w:p>
     <w:p>
@@ -3486,7 +3412,7 @@
           <v:shape id="_x0000_i1026" type="#_x0000_t75" style="width:75.75pt;height:49.45pt" o:ole="">
             <v:imagedata r:id="rId12" o:title=""/>
           </v:shape>
-          <o:OLEObject Type="Embed" ProgID="Package" ShapeID="_x0000_i1026" DrawAspect="Icon" ObjectID="_1835198642" r:id="rId13"/>
+          <o:OLEObject Type="Embed" ProgID="Package" ShapeID="_x0000_i1026" DrawAspect="Icon" ObjectID="_1838197988" r:id="rId13"/>
         </w:object>
       </w:r>
     </w:p>
@@ -3514,15 +3440,7 @@
         <w:jc w:val="both"/>
       </w:pPr>
       <w:r>
-        <w:t xml:space="preserve">El proceso describe como el administrador RPA lleva a cabo la ejecución del </w:t>
-      </w:r>
-      <w:proofErr w:type="spellStart"/>
-      <w:r>
-        <w:t>bot</w:t>
-      </w:r>
-      <w:proofErr w:type="spellEnd"/>
-      <w:r>
-        <w:t xml:space="preserve"> de manera diaria</w:t>
+        <w:t>El proceso describe como el administrador RPA lleva a cabo la ejecución del bot de manera diaria</w:t>
       </w:r>
       <w:r>
         <w:t xml:space="preserve"> a las 3:00 pm</w:t>
@@ -3552,15 +3470,7 @@
         <w:t>Coordinación de embarques</w:t>
       </w:r>
       <w:r>
-        <w:t xml:space="preserve"> teniendo en cuenta el nombre del archivo </w:t>
-      </w:r>
-      <w:proofErr w:type="spellStart"/>
-      <w:r>
-        <w:t>excel</w:t>
-      </w:r>
-      <w:proofErr w:type="spellEnd"/>
-      <w:r>
-        <w:t xml:space="preserve"> definido (Embarque 1)</w:t>
+        <w:t xml:space="preserve"> teniendo en cuenta el nombre del archivo excel definido (Embarque 1)</w:t>
       </w:r>
       <w:r>
         <w:t xml:space="preserve"> </w:t>
@@ -3590,15 +3500,7 @@
         <w:t xml:space="preserve"> </w:t>
       </w:r>
       <w:r>
-        <w:t xml:space="preserve">cabe resaltar que el </w:t>
-      </w:r>
-      <w:proofErr w:type="spellStart"/>
-      <w:r>
-        <w:t>bot</w:t>
-      </w:r>
-      <w:proofErr w:type="spellEnd"/>
-      <w:r>
-        <w:t xml:space="preserve"> creará </w:t>
+        <w:t xml:space="preserve">cabe resaltar que el bot creará </w:t>
       </w:r>
       <w:r>
         <w:t>sub</w:t>
@@ -3610,13 +3512,7 @@
         <w:t>s</w:t>
       </w:r>
       <w:r>
-        <w:t xml:space="preserve"> para cada </w:t>
-      </w:r>
-      <w:r>
-        <w:t xml:space="preserve">mes y </w:t>
-      </w:r>
-      <w:r>
-        <w:t>semana donde el usuario respectivamente deberá cargar los reportes según la semana actual</w:t>
+        <w:t xml:space="preserve"> para cada semana donde el usuario respectivamente deberá cargar los reportes según la semana actual</w:t>
       </w:r>
       <w:r>
         <w:t xml:space="preserve">. </w:t>
@@ -3628,13 +3524,8 @@
         <w:t xml:space="preserve"> vez que</w:t>
       </w:r>
       <w:r>
-        <w:t xml:space="preserve"> el </w:t>
-      </w:r>
-      <w:proofErr w:type="spellStart"/>
-      <w:r>
-        <w:t>bot</w:t>
-      </w:r>
-      <w:proofErr w:type="spellEnd"/>
+        <w:t xml:space="preserve"> el bot</w:t>
+      </w:r>
       <w:r>
         <w:t xml:space="preserve"> verifique la existencia de documentación</w:t>
       </w:r>
@@ -3684,15 +3575,7 @@
         <w:t xml:space="preserve">l </w:t>
       </w:r>
       <w:r>
-        <w:t xml:space="preserve">envío de </w:t>
-      </w:r>
-      <w:proofErr w:type="spellStart"/>
-      <w:r>
-        <w:t>COAs</w:t>
-      </w:r>
-      <w:proofErr w:type="spellEnd"/>
-      <w:r>
-        <w:t xml:space="preserve"> e informes de ensayo</w:t>
+        <w:t>envío de COAs e informes de ensayo</w:t>
       </w:r>
       <w:bookmarkEnd w:id="8"/>
     </w:p>
@@ -3768,7 +3651,7 @@
           <v:shape id="_x0000_i1027" type="#_x0000_t75" style="width:74.5pt;height:49.45pt" o:ole="">
             <v:imagedata r:id="rId15" o:title=""/>
           </v:shape>
-          <o:OLEObject Type="Embed" ProgID="Package" ShapeID="_x0000_i1027" DrawAspect="Icon" ObjectID="_1835198643" r:id="rId16"/>
+          <o:OLEObject Type="Embed" ProgID="Package" ShapeID="_x0000_i1027" DrawAspect="Icon" ObjectID="_1838197989" r:id="rId16"/>
         </w:object>
       </w:r>
     </w:p>
@@ -3785,15 +3668,7 @@
         <w:t xml:space="preserve">detallada del </w:t>
       </w:r>
       <w:r>
-        <w:t xml:space="preserve">AS IS del envío de </w:t>
-      </w:r>
-      <w:proofErr w:type="spellStart"/>
-      <w:r>
-        <w:t>COAs</w:t>
-      </w:r>
-      <w:proofErr w:type="spellEnd"/>
-      <w:r>
-        <w:t xml:space="preserve"> e informes de ensayo</w:t>
+        <w:t>AS IS del envío de COAs e informes de ensayo</w:t>
       </w:r>
       <w:bookmarkEnd w:id="9"/>
     </w:p>
@@ -3816,72 +3691,48 @@
         <w:t>según fecha y hora registrada en el reporte semanal.</w:t>
       </w:r>
       <w:r>
-        <w:t xml:space="preserve"> Luego, el analista de laboratorio realiza los informes de ensayo y el coordinador de laboratorio desarrolla los </w:t>
-      </w:r>
-      <w:proofErr w:type="spellStart"/>
-      <w:r>
-        <w:t>COAs</w:t>
-      </w:r>
-      <w:proofErr w:type="spellEnd"/>
-      <w:r>
-        <w:t xml:space="preserve"> para cada OP según orden correlativo de salida. Una vez tengan los documentos completos, cargan </w:t>
-      </w:r>
-      <w:r>
-        <w:t xml:space="preserve">los </w:t>
-      </w:r>
-      <w:proofErr w:type="spellStart"/>
-      <w:r>
-        <w:t>COAs</w:t>
-      </w:r>
-      <w:proofErr w:type="spellEnd"/>
+        <w:t xml:space="preserve"> Luego, el analista de laboratorio realiza los informes de ensayo y el coordinador de laboratorio desarrolla los COAs para cada OP según orden correlativo de salida. Una vez tengan los documentos completos, cargan </w:t>
+      </w:r>
+      <w:r>
+        <w:t xml:space="preserve">los COAs </w:t>
+      </w:r>
+      <w:r>
+        <w:t xml:space="preserve">a la carpeta compartida de Certificados Calidad Export </w:t>
+      </w:r>
+      <w:r>
+        <w:t>y los informes de ensayo a la carpeta R</w:t>
+      </w:r>
+      <w:r>
+        <w:t>eporte Cliente</w:t>
+      </w:r>
+      <w:r>
+        <w:t>s</w:t>
+      </w:r>
+      <w:r>
+        <w:t>. Después, el auxiliar</w:t>
+      </w:r>
+      <w:r>
+        <w:t xml:space="preserve"> de</w:t>
+      </w:r>
+      <w:r>
+        <w:t xml:space="preserve"> COMEX recibe la confirmación del área de Calidad</w:t>
+      </w:r>
+      <w:r>
+        <w:t xml:space="preserve"> de</w:t>
+      </w:r>
       <w:r>
         <w:t xml:space="preserve"> </w:t>
       </w:r>
       <w:r>
-        <w:t xml:space="preserve">a la carpeta compartida de Certificados Calidad </w:t>
-      </w:r>
-      <w:proofErr w:type="spellStart"/>
-      <w:r>
-        <w:t>Export</w:t>
-      </w:r>
-      <w:proofErr w:type="spellEnd"/>
+        <w:t xml:space="preserve">que toda la documentación requerida ha sido cargada </w:t>
+      </w:r>
+      <w:r>
+        <w:t>para que</w:t>
+      </w:r>
       <w:r>
         <w:t xml:space="preserve"> </w:t>
       </w:r>
       <w:r>
-        <w:t>y los informes de ensayo a la carpeta R</w:t>
-      </w:r>
-      <w:r>
-        <w:t>eporte Cliente</w:t>
-      </w:r>
-      <w:r>
-        <w:t>s</w:t>
-      </w:r>
-      <w:r>
-        <w:t>. Después, el auxiliar</w:t>
-      </w:r>
-      <w:r>
-        <w:t xml:space="preserve"> de</w:t>
-      </w:r>
-      <w:r>
-        <w:t xml:space="preserve"> COMEX recibe la confirmación del área de Calidad</w:t>
-      </w:r>
-      <w:r>
-        <w:t xml:space="preserve"> de</w:t>
-      </w:r>
-      <w:r>
-        <w:t xml:space="preserve"> </w:t>
-      </w:r>
-      <w:r>
-        <w:t xml:space="preserve">que toda la documentación requerida ha sido cargada </w:t>
-      </w:r>
-      <w:r>
-        <w:t>para que</w:t>
-      </w:r>
-      <w:r>
-        <w:t xml:space="preserve"> </w:t>
-      </w:r>
-      <w:r>
         <w:t xml:space="preserve">posteriormente </w:t>
       </w:r>
       <w:r>
@@ -3897,15 +3748,7 @@
         <w:t xml:space="preserve">cada una de las carpetas compartidas </w:t>
       </w:r>
       <w:r>
-        <w:t xml:space="preserve">los </w:t>
-      </w:r>
-      <w:proofErr w:type="spellStart"/>
-      <w:r>
-        <w:t>COAs</w:t>
-      </w:r>
-      <w:proofErr w:type="spellEnd"/>
-      <w:r>
-        <w:t xml:space="preserve"> e informes asociados a la referencia embarcada,</w:t>
+        <w:t>los COAs e informes asociados a la referencia embarcada,</w:t>
       </w:r>
       <w:r>
         <w:t xml:space="preserve"> y como </w:t>
@@ -3914,26 +3757,10 @@
         <w:t>ú</w:t>
       </w:r>
       <w:r>
-        <w:t xml:space="preserve">ltimo filtro verifica que la referencia, cliente y lotes coincidan con la información de embarque y el </w:t>
-      </w:r>
-      <w:proofErr w:type="spellStart"/>
-      <w:r>
-        <w:t>p</w:t>
-      </w:r>
-      <w:r>
-        <w:t>acking</w:t>
-      </w:r>
-      <w:proofErr w:type="spellEnd"/>
-      <w:r>
-        <w:t xml:space="preserve"> </w:t>
-      </w:r>
-      <w:proofErr w:type="spellStart"/>
-      <w:r>
-        <w:t>list</w:t>
-      </w:r>
-      <w:proofErr w:type="spellEnd"/>
-      <w:r>
-        <w:t>.</w:t>
+        <w:t>ltimo filtro verifica que la referencia, cliente y lotes coincidan con la información de embarque y el p</w:t>
+      </w:r>
+      <w:r>
+        <w:t>acking list.</w:t>
       </w:r>
     </w:p>
     <w:p>
@@ -3989,15 +3816,7 @@
         <w:t>l</w:t>
       </w:r>
       <w:r>
-        <w:t xml:space="preserve"> envío de </w:t>
-      </w:r>
-      <w:proofErr w:type="spellStart"/>
-      <w:r>
-        <w:t>COAs</w:t>
-      </w:r>
-      <w:proofErr w:type="spellEnd"/>
-      <w:r>
-        <w:t xml:space="preserve"> e informes de ensayo</w:t>
+        <w:t xml:space="preserve"> envío de COAs e informes de ensayo</w:t>
       </w:r>
       <w:bookmarkEnd w:id="10"/>
     </w:p>
@@ -4073,7 +3892,7 @@
           <v:shape id="_x0000_i1028" type="#_x0000_t75" style="width:74.5pt;height:49.45pt" o:ole="">
             <v:imagedata r:id="rId18" o:title=""/>
           </v:shape>
-          <o:OLEObject Type="Embed" ProgID="Package" ShapeID="_x0000_i1028" DrawAspect="Icon" ObjectID="_1835198644" r:id="rId19"/>
+          <o:OLEObject Type="Embed" ProgID="Package" ShapeID="_x0000_i1028" DrawAspect="Icon" ObjectID="_1838197990" r:id="rId19"/>
         </w:object>
       </w:r>
     </w:p>
@@ -4248,15 +4067,7 @@
               <w:t xml:space="preserve"> </w:t>
             </w:r>
             <w:r>
-              <w:t xml:space="preserve">identifica la palabra COMPLETO en las columnas </w:t>
-            </w:r>
-            <w:proofErr w:type="spellStart"/>
-            <w:r>
-              <w:t>COAs</w:t>
-            </w:r>
-            <w:proofErr w:type="spellEnd"/>
-            <w:r>
-              <w:t xml:space="preserve"> e informes según </w:t>
+              <w:t xml:space="preserve">identifica la palabra COMPLETO en las columnas COAs e informes según </w:t>
             </w:r>
             <w:r>
               <w:t>el número de referencia por embarque.</w:t>
@@ -4466,13 +4277,8 @@
             <w:r>
               <w:t xml:space="preserve">Luego, el </w:t>
             </w:r>
-            <w:proofErr w:type="spellStart"/>
-            <w:r>
-              <w:t>bot</w:t>
-            </w:r>
-            <w:proofErr w:type="spellEnd"/>
-            <w:r>
-              <w:t xml:space="preserve"> registra la incidencia</w:t>
+            <w:r>
+              <w:t>bot registra la incidencia</w:t>
             </w:r>
             <w:r>
               <w:t xml:space="preserve"> en bitácora y vuelve al punto inicial.</w:t>
@@ -4506,29 +4312,13 @@
               <w:spacing w:line="360" w:lineRule="auto"/>
             </w:pPr>
             <w:r>
-              <w:t xml:space="preserve">No obstante, si el </w:t>
-            </w:r>
-            <w:proofErr w:type="spellStart"/>
-            <w:r>
-              <w:t>bot</w:t>
-            </w:r>
-            <w:proofErr w:type="spellEnd"/>
-            <w:r>
-              <w:t xml:space="preserve"> valida que existen documentos nuevos, </w:t>
+              <w:t xml:space="preserve">No obstante, si el bot valida que existen documentos nuevos, </w:t>
             </w:r>
             <w:r>
               <w:t xml:space="preserve">identifica automáticamente la línea de negocio, referencia embarcada y cliente </w:t>
             </w:r>
             <w:r>
-              <w:t xml:space="preserve">en la ruta de Certificados Calidad </w:t>
-            </w:r>
-            <w:proofErr w:type="spellStart"/>
-            <w:r>
-              <w:t>Export</w:t>
-            </w:r>
-            <w:proofErr w:type="spellEnd"/>
-            <w:r>
-              <w:t>.</w:t>
+              <w:t>en la ruta de Certificados Calidad Export.</w:t>
             </w:r>
           </w:p>
         </w:tc>
@@ -4636,15 +4426,7 @@
               <w:t xml:space="preserve">Cada informe de ensayo identificado es </w:t>
             </w:r>
             <w:r>
-              <w:t xml:space="preserve">descargado automáticamente por el </w:t>
-            </w:r>
-            <w:proofErr w:type="spellStart"/>
-            <w:r>
-              <w:t>bot</w:t>
-            </w:r>
-            <w:proofErr w:type="spellEnd"/>
-            <w:r>
-              <w:t>.</w:t>
+              <w:t>descargado automáticamente por el bot.</w:t>
             </w:r>
           </w:p>
         </w:tc>
@@ -4696,15 +4478,7 @@
               <w:t>n</w:t>
             </w:r>
             <w:r>
-              <w:t xml:space="preserve"> los </w:t>
-            </w:r>
-            <w:proofErr w:type="spellStart"/>
-            <w:r>
-              <w:t>COAs</w:t>
-            </w:r>
-            <w:proofErr w:type="spellEnd"/>
-            <w:r>
-              <w:t xml:space="preserve"> e informes de ensayo en un único PDF con nombre estándar (REF</w:t>
+              <w:t xml:space="preserve"> los COAs e informes de ensayo en un único PDF con nombre estándar (REF</w:t>
             </w:r>
             <w:r>
               <w:t xml:space="preserve"> </w:t>
@@ -4747,15 +4521,7 @@
               <w:t>, e</w:t>
             </w:r>
             <w:r>
-              <w:t xml:space="preserve">l </w:t>
-            </w:r>
-            <w:proofErr w:type="spellStart"/>
-            <w:r>
-              <w:t>bot</w:t>
-            </w:r>
-            <w:proofErr w:type="spellEnd"/>
-            <w:r>
-              <w:t xml:space="preserve"> redacta el correo utilizando una plantilla definida, </w:t>
+              <w:t xml:space="preserve">l bot redacta el correo utilizando una plantilla definida, </w:t>
             </w:r>
             <w:r>
               <w:t>teniendo en cuenta que el nombre del asunto es PO-número || OP-número || Riverside.</w:t>
@@ -4795,15 +4561,7 @@
               <w:t>El correo es enviado automáticamente a los destinatarios configurado</w:t>
             </w:r>
             <w:r>
-              <w:t xml:space="preserve">s en un </w:t>
-            </w:r>
-            <w:proofErr w:type="spellStart"/>
-            <w:r>
-              <w:t>txt</w:t>
-            </w:r>
-            <w:proofErr w:type="spellEnd"/>
-            <w:r>
-              <w:t>.</w:t>
+              <w:t>s en un txt.</w:t>
             </w:r>
             <w:r>
               <w:t xml:space="preserve"> </w:t>
@@ -4850,15 +4608,7 @@
               <w:t>Después, e</w:t>
             </w:r>
             <w:r>
-              <w:t xml:space="preserve">l </w:t>
-            </w:r>
-            <w:proofErr w:type="spellStart"/>
-            <w:r>
-              <w:t>bot</w:t>
-            </w:r>
-            <w:proofErr w:type="spellEnd"/>
-            <w:r>
-              <w:t xml:space="preserve"> registra el resultado del envío</w:t>
+              <w:t>l bot registra el resultado del envío</w:t>
             </w:r>
             <w:r>
               <w:t xml:space="preserve"> en bitácora,</w:t>
@@ -4941,14 +4691,9 @@
         <w:t>l</w:t>
       </w:r>
       <w:r>
-        <w:t xml:space="preserve"> envío de </w:t>
-      </w:r>
-      <w:proofErr w:type="spellStart"/>
-      <w:r>
-        <w:t>Invoice</w:t>
+        <w:t xml:space="preserve"> envío de Invoice</w:t>
       </w:r>
       <w:bookmarkEnd w:id="12"/>
-      <w:proofErr w:type="spellEnd"/>
     </w:p>
     <w:p>
       <w:pPr>
@@ -5022,7 +4767,7 @@
           <v:shape id="_x0000_i1029" type="#_x0000_t75" style="width:74.5pt;height:49.45pt" o:ole="">
             <v:imagedata r:id="rId21" o:title=""/>
           </v:shape>
-          <o:OLEObject Type="Embed" ProgID="Package" ShapeID="_x0000_i1029" DrawAspect="Icon" ObjectID="_1835198645" r:id="rId22"/>
+          <o:OLEObject Type="Embed" ProgID="Package" ShapeID="_x0000_i1029" DrawAspect="Icon" ObjectID="_1838197991" r:id="rId22"/>
         </w:object>
       </w:r>
     </w:p>
@@ -5052,14 +4797,9 @@
         <w:t>l</w:t>
       </w:r>
       <w:r>
-        <w:t xml:space="preserve"> envío de </w:t>
-      </w:r>
-      <w:proofErr w:type="spellStart"/>
-      <w:r>
-        <w:t>Invoice</w:t>
+        <w:t xml:space="preserve"> envío de Invoice</w:t>
       </w:r>
       <w:bookmarkEnd w:id="13"/>
-      <w:proofErr w:type="spellEnd"/>
     </w:p>
     <w:tbl>
       <w:tblPr>
@@ -5729,21 +5469,8 @@
             <w:r>
               <w:t xml:space="preserve"> para </w:t>
             </w:r>
-            <w:proofErr w:type="spellStart"/>
-            <w:r>
-              <w:t>Invoice</w:t>
-            </w:r>
-            <w:proofErr w:type="spellEnd"/>
-            <w:r>
-              <w:t xml:space="preserve"> (número de referencia + </w:t>
-            </w:r>
-            <w:proofErr w:type="spellStart"/>
-            <w:r>
-              <w:t>Invoice</w:t>
-            </w:r>
-            <w:proofErr w:type="spellEnd"/>
-            <w:r>
-              <w:t>) en carpeta Specialty.</w:t>
+            <w:r>
+              <w:t>Invoice (número de referencia + Invoice) en carpeta Specialty.</w:t>
             </w:r>
           </w:p>
         </w:tc>
@@ -5874,14 +5601,9 @@
         <w:t>l</w:t>
       </w:r>
       <w:r>
-        <w:t xml:space="preserve"> envío de </w:t>
-      </w:r>
-      <w:proofErr w:type="spellStart"/>
-      <w:r>
-        <w:t>Invoice</w:t>
+        <w:t xml:space="preserve"> envío de Invoice</w:t>
       </w:r>
       <w:bookmarkEnd w:id="14"/>
-      <w:proofErr w:type="spellEnd"/>
     </w:p>
     <w:p>
       <w:pPr>
@@ -5955,7 +5677,7 @@
           <v:shape id="_x0000_i1030" type="#_x0000_t75" style="width:74.5pt;height:49.45pt" o:ole="">
             <v:imagedata r:id="rId24" o:title=""/>
           </v:shape>
-          <o:OLEObject Type="Embed" ProgID="Package" ShapeID="_x0000_i1030" DrawAspect="Icon" ObjectID="_1835198646" r:id="rId25"/>
+          <o:OLEObject Type="Embed" ProgID="Package" ShapeID="_x0000_i1030" DrawAspect="Icon" ObjectID="_1838197992" r:id="rId25"/>
         </w:object>
       </w:r>
     </w:p>
@@ -5978,14 +5700,9 @@
         <w:t>l</w:t>
       </w:r>
       <w:r>
-        <w:t xml:space="preserve"> envío de </w:t>
-      </w:r>
-      <w:proofErr w:type="spellStart"/>
-      <w:r>
-        <w:t>Invoice</w:t>
+        <w:t xml:space="preserve"> envío de Invoice</w:t>
       </w:r>
       <w:bookmarkEnd w:id="15"/>
-      <w:proofErr w:type="spellEnd"/>
     </w:p>
     <w:p>
       <w:pPr>
@@ -6023,11 +5740,9 @@
       <w:r>
         <w:t xml:space="preserve"> + “</w:t>
       </w:r>
-      <w:proofErr w:type="spellStart"/>
       <w:r>
         <w:t>Invoice</w:t>
       </w:r>
-      <w:proofErr w:type="spellEnd"/>
       <w:r>
         <w:t>”</w:t>
       </w:r>
@@ -6073,11 +5788,9 @@
       <w:r>
         <w:t xml:space="preserve"> + “</w:t>
       </w:r>
-      <w:proofErr w:type="spellStart"/>
       <w:r>
         <w:t>Invoice</w:t>
       </w:r>
-      <w:proofErr w:type="spellEnd"/>
       <w:r>
         <w:t>” + “</w:t>
       </w:r>
@@ -6088,15 +5801,7 @@
         <w:t>” + Número de PO</w:t>
       </w:r>
       <w:r>
-        <w:t xml:space="preserve">). A las 3:00 p.m. el RPA se ejecuta, identifica los embarques según el reporte de coordinación, valida la existencia de los archivos </w:t>
-      </w:r>
-      <w:proofErr w:type="spellStart"/>
-      <w:r>
-        <w:t>Invoice</w:t>
-      </w:r>
-      <w:proofErr w:type="spellEnd"/>
-      <w:r>
-        <w:t xml:space="preserve"> dentro de cada </w:t>
+        <w:t xml:space="preserve">). A las 3:00 p.m. el RPA se ejecuta, identifica los embarques según el reporte de coordinación, valida la existencia de los archivos Invoice dentro de cada </w:t>
       </w:r>
       <w:r>
         <w:t>sub</w:t>
@@ -6124,15 +5829,7 @@
         <w:t xml:space="preserve">si </w:t>
       </w:r>
       <w:r>
-        <w:t xml:space="preserve">el </w:t>
-      </w:r>
-      <w:proofErr w:type="spellStart"/>
-      <w:r>
-        <w:t>bot</w:t>
-      </w:r>
-      <w:proofErr w:type="spellEnd"/>
-      <w:r>
-        <w:t xml:space="preserve"> </w:t>
+        <w:t xml:space="preserve">el bot </w:t>
       </w:r>
       <w:r>
         <w:t>no detecta archivos, notifica la incidencia al área COMEX.</w:t>
@@ -6455,21 +6152,7 @@
               <w:rPr>
                 <w:szCs w:val="20"/>
               </w:rPr>
-              <w:t xml:space="preserve">El </w:t>
-            </w:r>
-            <w:proofErr w:type="spellStart"/>
-            <w:r>
-              <w:rPr>
-                <w:szCs w:val="20"/>
-              </w:rPr>
-              <w:t>bot</w:t>
-            </w:r>
-            <w:proofErr w:type="spellEnd"/>
-            <w:r>
-              <w:rPr>
-                <w:szCs w:val="20"/>
-              </w:rPr>
-              <w:t xml:space="preserve"> solo deberá considerar documentos ubicados en las rutas oficiales del proyecto.</w:t>
+              <w:t>El bot solo deberá considerar documentos ubicados en las rutas oficiales del proyecto.</w:t>
             </w:r>
           </w:p>
           <w:p>
@@ -6488,40 +6171,47 @@
                 <w:bCs/>
                 <w:szCs w:val="20"/>
               </w:rPr>
-              <w:t xml:space="preserve">Carpeta </w:t>
-            </w:r>
-            <w:proofErr w:type="spellStart"/>
+              <w:t>Carpeta COAs:</w:t>
+            </w:r>
+            <w:r>
+              <w:rPr>
+                <w:szCs w:val="20"/>
+              </w:rPr>
+              <w:t xml:space="preserve"> Certificados Calidad Export</w:t>
+            </w:r>
+          </w:p>
+          <w:p>
+            <w:pPr>
+              <w:pStyle w:val="Estilo5"/>
+              <w:spacing w:line="360" w:lineRule="auto"/>
+              <w:ind w:left="360"/>
+              <w:jc w:val="both"/>
+              <w:rPr>
+                <w:szCs w:val="20"/>
+              </w:rPr>
+            </w:pPr>
             <w:r>
               <w:rPr>
                 <w:b/>
                 <w:bCs/>
                 <w:szCs w:val="20"/>
               </w:rPr>
-              <w:t>COAs</w:t>
-            </w:r>
-            <w:proofErr w:type="spellEnd"/>
+              <w:t>Carpetas informes</w:t>
+            </w:r>
             <w:r>
               <w:rPr>
                 <w:b/>
                 <w:bCs/>
                 <w:szCs w:val="20"/>
               </w:rPr>
-              <w:t>:</w:t>
-            </w:r>
-            <w:r>
-              <w:rPr>
-                <w:szCs w:val="20"/>
-              </w:rPr>
-              <w:t xml:space="preserve"> Certificados Calidad </w:t>
-            </w:r>
-            <w:proofErr w:type="spellStart"/>
-            <w:r>
-              <w:rPr>
-                <w:szCs w:val="20"/>
-              </w:rPr>
-              <w:t>Export</w:t>
-            </w:r>
-            <w:proofErr w:type="spellEnd"/>
+              <w:t xml:space="preserve"> de ensayo:</w:t>
+            </w:r>
+            <w:r>
+              <w:rPr>
+                <w:szCs w:val="20"/>
+              </w:rPr>
+              <w:t xml:space="preserve"> Reporte Clientes</w:t>
+            </w:r>
           </w:p>
           <w:p>
             <w:pPr>
@@ -6539,58 +6229,7 @@
                 <w:bCs/>
                 <w:szCs w:val="20"/>
               </w:rPr>
-              <w:t>Carpetas informes</w:t>
-            </w:r>
-            <w:r>
-              <w:rPr>
-                <w:b/>
-                <w:bCs/>
-                <w:szCs w:val="20"/>
-              </w:rPr>
-              <w:t xml:space="preserve"> de ensayo:</w:t>
-            </w:r>
-            <w:r>
-              <w:rPr>
-                <w:szCs w:val="20"/>
-              </w:rPr>
-              <w:t xml:space="preserve"> Reporte Clientes</w:t>
-            </w:r>
-          </w:p>
-          <w:p>
-            <w:pPr>
-              <w:pStyle w:val="Estilo5"/>
-              <w:spacing w:line="360" w:lineRule="auto"/>
-              <w:ind w:left="360"/>
-              <w:jc w:val="both"/>
-              <w:rPr>
-                <w:szCs w:val="20"/>
-              </w:rPr>
-            </w:pPr>
-            <w:r>
-              <w:rPr>
-                <w:b/>
-                <w:bCs/>
-                <w:szCs w:val="20"/>
-              </w:rPr>
-              <w:t xml:space="preserve">Carpeta </w:t>
-            </w:r>
-            <w:proofErr w:type="spellStart"/>
-            <w:r>
-              <w:rPr>
-                <w:b/>
-                <w:bCs/>
-                <w:szCs w:val="20"/>
-              </w:rPr>
-              <w:t>Invoice</w:t>
-            </w:r>
-            <w:proofErr w:type="spellEnd"/>
-            <w:r>
-              <w:rPr>
-                <w:b/>
-                <w:bCs/>
-                <w:szCs w:val="20"/>
-              </w:rPr>
-              <w:t>:</w:t>
+              <w:t>Carpeta Invoice:</w:t>
             </w:r>
             <w:r>
               <w:rPr>
@@ -6720,7 +6359,6 @@
               </w:rPr>
               <w:t xml:space="preserve">Para </w:t>
             </w:r>
-            <w:proofErr w:type="spellStart"/>
             <w:r>
               <w:rPr>
                 <w:szCs w:val="20"/>
@@ -6731,14 +6369,7 @@
               <w:rPr>
                 <w:szCs w:val="20"/>
               </w:rPr>
-              <w:t>nvoice</w:t>
-            </w:r>
-            <w:proofErr w:type="spellEnd"/>
-            <w:r>
-              <w:rPr>
-                <w:szCs w:val="20"/>
-              </w:rPr>
-              <w:t xml:space="preserve">, el envío </w:t>
+              <w:t xml:space="preserve">nvoice, el envío </w:t>
             </w:r>
             <w:r>
               <w:rPr>
@@ -6759,15 +6390,7 @@
               <w:t xml:space="preserve"> con la nomenclatura ya definida (</w:t>
             </w:r>
             <w:r>
-              <w:t xml:space="preserve">número de referencia + </w:t>
-            </w:r>
-            <w:proofErr w:type="spellStart"/>
-            <w:r>
-              <w:t>Invoice</w:t>
-            </w:r>
-            <w:proofErr w:type="spellEnd"/>
-            <w:r>
-              <w:t>)</w:t>
+              <w:t>número de referencia + Invoice)</w:t>
             </w:r>
             <w:r>
               <w:rPr>
@@ -6810,14 +6433,7 @@
               <w:rPr>
                 <w:szCs w:val="20"/>
               </w:rPr>
-              <w:t xml:space="preserve"> Número de Referencia + “</w:t>
-            </w:r>
-            <w:proofErr w:type="spellStart"/>
-            <w:r>
-              <w:rPr>
-                <w:szCs w:val="20"/>
-              </w:rPr>
-              <w:t>I</w:t>
+              <w:t xml:space="preserve"> Número de Referencia + “I</w:t>
             </w:r>
             <w:r>
               <w:rPr>
@@ -6825,7 +6441,6 @@
               </w:rPr>
               <w:t>nvoice</w:t>
             </w:r>
-            <w:proofErr w:type="spellEnd"/>
             <w:r>
               <w:rPr>
                 <w:szCs w:val="20"/>
@@ -6920,7 +6535,6 @@
               </w:rPr>
               <w:t xml:space="preserve">El RPA deberá acceder y operar únicamente sobre las carpetas compartidas definidas para certificados, informes, </w:t>
             </w:r>
-            <w:proofErr w:type="spellStart"/>
             <w:r>
               <w:rPr>
                 <w:szCs w:val="20"/>
@@ -6931,14 +6545,7 @@
               <w:rPr>
                 <w:szCs w:val="20"/>
               </w:rPr>
-              <w:t>voice</w:t>
-            </w:r>
-            <w:proofErr w:type="spellEnd"/>
-            <w:r>
-              <w:rPr>
-                <w:szCs w:val="20"/>
-              </w:rPr>
-              <w:t xml:space="preserve"> y archivos de embarque.</w:t>
+              <w:t>voice y archivos de embarque.</w:t>
             </w:r>
           </w:p>
           <w:p>
@@ -6958,21 +6565,7 @@
               <w:rPr>
                 <w:szCs w:val="20"/>
               </w:rPr>
-              <w:t xml:space="preserve">Las rutas de carpetas deberán mantenerse fijas y no podrán ser modificadas durante la ejecución del </w:t>
-            </w:r>
-            <w:proofErr w:type="spellStart"/>
-            <w:r>
-              <w:rPr>
-                <w:szCs w:val="20"/>
-              </w:rPr>
-              <w:t>bot</w:t>
-            </w:r>
-            <w:proofErr w:type="spellEnd"/>
-            <w:r>
-              <w:rPr>
-                <w:szCs w:val="20"/>
-              </w:rPr>
-              <w:t>.</w:t>
+              <w:t>Las rutas de carpetas deberán mantenerse fijas y no podrán ser modificadas durante la ejecución del bot.</w:t>
             </w:r>
           </w:p>
           <w:p>
@@ -6992,21 +6585,7 @@
               <w:rPr>
                 <w:szCs w:val="20"/>
               </w:rPr>
-              <w:t xml:space="preserve">El </w:t>
-            </w:r>
-            <w:proofErr w:type="spellStart"/>
-            <w:r>
-              <w:rPr>
-                <w:szCs w:val="20"/>
-              </w:rPr>
-              <w:t>bot</w:t>
-            </w:r>
-            <w:proofErr w:type="spellEnd"/>
-            <w:r>
-              <w:rPr>
-                <w:szCs w:val="20"/>
-              </w:rPr>
-              <w:t xml:space="preserve"> deberá identificar la línea de negocio, cliente y referencia a partir de la estructura de carpetas.</w:t>
+              <w:t>El bot deberá identificar la línea de negocio, cliente y referencia a partir de la estructura de carpetas.</w:t>
             </w:r>
           </w:p>
         </w:tc>
@@ -7083,49 +6662,7 @@
               <w:rPr>
                 <w:szCs w:val="20"/>
               </w:rPr>
-              <w:t xml:space="preserve">REF – </w:t>
-            </w:r>
-            <w:proofErr w:type="spellStart"/>
-            <w:r>
-              <w:rPr>
-                <w:szCs w:val="20"/>
-              </w:rPr>
-              <w:t>Quality</w:t>
-            </w:r>
-            <w:proofErr w:type="spellEnd"/>
-            <w:r>
-              <w:rPr>
-                <w:szCs w:val="20"/>
-              </w:rPr>
-              <w:t xml:space="preserve"> </w:t>
-            </w:r>
-            <w:proofErr w:type="spellStart"/>
-            <w:r>
-              <w:rPr>
-                <w:szCs w:val="20"/>
-              </w:rPr>
-              <w:t>Certificate</w:t>
-            </w:r>
-            <w:proofErr w:type="spellEnd"/>
-            <w:r>
-              <w:rPr>
-                <w:szCs w:val="20"/>
-              </w:rPr>
-              <w:t xml:space="preserve"> &amp; Test </w:t>
-            </w:r>
-            <w:proofErr w:type="spellStart"/>
-            <w:r>
-              <w:rPr>
-                <w:szCs w:val="20"/>
-              </w:rPr>
-              <w:t>Reports</w:t>
-            </w:r>
-            <w:proofErr w:type="spellEnd"/>
-            <w:r>
-              <w:rPr>
-                <w:szCs w:val="20"/>
-              </w:rPr>
-              <w:t>”.</w:t>
+              <w:t>REF – Quality Certificate &amp; Test Reports”.</w:t>
             </w:r>
           </w:p>
           <w:p>
@@ -7147,7 +6684,6 @@
               </w:rPr>
               <w:t xml:space="preserve">Para </w:t>
             </w:r>
-            <w:proofErr w:type="spellStart"/>
             <w:r>
               <w:rPr>
                 <w:szCs w:val="20"/>
@@ -7158,14 +6694,7 @@
               <w:rPr>
                 <w:szCs w:val="20"/>
               </w:rPr>
-              <w:t>nvoice</w:t>
-            </w:r>
-            <w:proofErr w:type="spellEnd"/>
-            <w:r>
-              <w:rPr>
-                <w:szCs w:val="20"/>
-              </w:rPr>
-              <w:t>, el archivo deberá conservar la nomenclatura estándar definida: número de referencia</w:t>
+              <w:t>nvoice, el archivo deberá conservar la nomenclatura estándar definida: número de referencia</w:t>
             </w:r>
             <w:r>
               <w:rPr>
@@ -7179,14 +6708,12 @@
               </w:rPr>
               <w:t>“</w:t>
             </w:r>
-            <w:proofErr w:type="spellStart"/>
             <w:r>
               <w:rPr>
                 <w:szCs w:val="20"/>
               </w:rPr>
               <w:t>Invoice</w:t>
             </w:r>
-            <w:proofErr w:type="spellEnd"/>
             <w:r>
               <w:rPr>
                 <w:szCs w:val="20"/>
@@ -7225,21 +6752,7 @@
               <w:rPr>
                 <w:szCs w:val="20"/>
               </w:rPr>
-              <w:t xml:space="preserve"> Número de Referencia + “</w:t>
-            </w:r>
-            <w:proofErr w:type="spellStart"/>
-            <w:r>
-              <w:rPr>
-                <w:szCs w:val="20"/>
-              </w:rPr>
-              <w:t>Invoice</w:t>
-            </w:r>
-            <w:proofErr w:type="spellEnd"/>
-            <w:r>
-              <w:rPr>
-                <w:szCs w:val="20"/>
-              </w:rPr>
-              <w:t>” + “PO” + Número de PO</w:t>
+              <w:t xml:space="preserve"> Número de Referencia + “Invoice” + “PO” + Número de PO</w:t>
             </w:r>
           </w:p>
         </w:tc>
@@ -7322,21 +6835,7 @@
               <w:rPr>
                 <w:szCs w:val="20"/>
               </w:rPr>
-              <w:t xml:space="preserve">únicamente a los destinatarios previamente configurados en un </w:t>
-            </w:r>
-            <w:proofErr w:type="spellStart"/>
-            <w:r>
-              <w:rPr>
-                <w:szCs w:val="20"/>
-              </w:rPr>
-              <w:t>txt</w:t>
-            </w:r>
-            <w:proofErr w:type="spellEnd"/>
-            <w:r>
-              <w:rPr>
-                <w:szCs w:val="20"/>
-              </w:rPr>
-              <w:t>.</w:t>
+              <w:t>únicamente a los destinatarios previamente configurados en un txt.</w:t>
             </w:r>
             <w:r>
               <w:rPr>
@@ -7390,16 +6889,8 @@
               <w:rPr>
                 <w:szCs w:val="20"/>
               </w:rPr>
-              <w:t xml:space="preserve">Para </w:t>
-            </w:r>
-            <w:proofErr w:type="spellStart"/>
-            <w:r>
-              <w:rPr>
-                <w:szCs w:val="20"/>
-              </w:rPr>
-              <w:t>COAs</w:t>
-            </w:r>
-            <w:proofErr w:type="spellEnd"/>
+              <w:t>Para COAs</w:t>
+            </w:r>
             <w:r>
               <w:rPr>
                 <w:szCs w:val="20"/>
@@ -7651,35 +7142,7 @@
               <w:rPr>
                 <w:szCs w:val="20"/>
               </w:rPr>
-              <w:t xml:space="preserve"> para </w:t>
-            </w:r>
-            <w:proofErr w:type="spellStart"/>
-            <w:r>
-              <w:rPr>
-                <w:szCs w:val="20"/>
-              </w:rPr>
-              <w:t>COAs</w:t>
-            </w:r>
-            <w:proofErr w:type="spellEnd"/>
-            <w:r>
-              <w:rPr>
-                <w:szCs w:val="20"/>
-              </w:rPr>
-              <w:t xml:space="preserve"> e </w:t>
-            </w:r>
-            <w:proofErr w:type="spellStart"/>
-            <w:r>
-              <w:rPr>
-                <w:szCs w:val="20"/>
-              </w:rPr>
-              <w:t>Invoice</w:t>
-            </w:r>
-            <w:proofErr w:type="spellEnd"/>
-            <w:r>
-              <w:rPr>
-                <w:szCs w:val="20"/>
-              </w:rPr>
-              <w:t xml:space="preserve"> </w:t>
+              <w:t xml:space="preserve"> para COAs e Invoice </w:t>
             </w:r>
             <w:r>
               <w:rPr>
@@ -7883,21 +7346,7 @@
               <w:rPr>
                 <w:szCs w:val="20"/>
               </w:rPr>
-              <w:t xml:space="preserve">El </w:t>
-            </w:r>
-            <w:proofErr w:type="spellStart"/>
-            <w:r>
-              <w:rPr>
-                <w:szCs w:val="20"/>
-              </w:rPr>
-              <w:t>bot</w:t>
-            </w:r>
-            <w:proofErr w:type="spellEnd"/>
-            <w:r>
-              <w:rPr>
-                <w:szCs w:val="20"/>
-              </w:rPr>
-              <w:t xml:space="preserve"> creará una carpeta</w:t>
+              <w:t>El bot creará una carpeta</w:t>
             </w:r>
             <w:r>
               <w:rPr>
@@ -7953,21 +7402,7 @@
               <w:rPr>
                 <w:szCs w:val="20"/>
               </w:rPr>
-              <w:t xml:space="preserve">La plantilla compartida de Excel con Calidad y COMEX tendrá la columna de </w:t>
-            </w:r>
-            <w:proofErr w:type="spellStart"/>
-            <w:r>
-              <w:rPr>
-                <w:szCs w:val="20"/>
-              </w:rPr>
-              <w:t>OPs</w:t>
-            </w:r>
-            <w:proofErr w:type="spellEnd"/>
-            <w:r>
-              <w:rPr>
-                <w:szCs w:val="20"/>
-              </w:rPr>
-              <w:t xml:space="preserve"> actualizada cada semana, estos datos se extraerán del reporte de embarques, </w:t>
+              <w:t xml:space="preserve">La plantilla compartida de Excel con Calidad y COMEX tendrá la columna de OPs actualizada cada semana, estos datos se extraerán del reporte de embarques, </w:t>
             </w:r>
           </w:p>
           <w:p>
@@ -7993,41 +7428,13 @@
               <w:rPr>
                 <w:szCs w:val="20"/>
               </w:rPr>
-              <w:t xml:space="preserve">el </w:t>
-            </w:r>
-            <w:proofErr w:type="gramStart"/>
-            <w:r>
-              <w:rPr>
-                <w:szCs w:val="20"/>
-              </w:rPr>
-              <w:t>status</w:t>
-            </w:r>
-            <w:proofErr w:type="gramEnd"/>
-            <w:r>
-              <w:rPr>
-                <w:szCs w:val="20"/>
-              </w:rPr>
-              <w:t xml:space="preserve"> </w:t>
-            </w:r>
-            <w:r>
-              <w:rPr>
-                <w:szCs w:val="20"/>
-              </w:rPr>
-              <w:t xml:space="preserve">de los </w:t>
-            </w:r>
-            <w:proofErr w:type="spellStart"/>
-            <w:r>
-              <w:rPr>
-                <w:szCs w:val="20"/>
-              </w:rPr>
-              <w:t>COAs</w:t>
-            </w:r>
-            <w:proofErr w:type="spellEnd"/>
-            <w:r>
-              <w:rPr>
-                <w:szCs w:val="20"/>
-              </w:rPr>
-              <w:t xml:space="preserve"> e informes </w:t>
+              <w:t xml:space="preserve">el status </w:t>
+            </w:r>
+            <w:r>
+              <w:rPr>
+                <w:szCs w:val="20"/>
+              </w:rPr>
+              <w:t xml:space="preserve">de los COAs e informes </w:t>
             </w:r>
             <w:r>
               <w:rPr>
@@ -8127,23 +7534,7 @@
         <w:jc w:val="both"/>
       </w:pPr>
       <w:r>
-        <w:t xml:space="preserve">Archivo Excel </w:t>
-      </w:r>
-      <w:proofErr w:type="gramStart"/>
-      <w:r>
-        <w:t>status</w:t>
-      </w:r>
-      <w:proofErr w:type="gramEnd"/>
-      <w:r>
-        <w:t xml:space="preserve"> de </w:t>
-      </w:r>
-      <w:proofErr w:type="spellStart"/>
-      <w:r>
-        <w:t>COAs</w:t>
-      </w:r>
-      <w:proofErr w:type="spellEnd"/>
-      <w:r>
-        <w:t xml:space="preserve"> e informes.</w:t>
+        <w:t>Archivo Excel status de COAs e informes.</w:t>
       </w:r>
     </w:p>
     <w:p>
@@ -8193,15 +7584,7 @@
         <w:t xml:space="preserve"> Luego, </w:t>
       </w:r>
       <w:r>
-        <w:t xml:space="preserve">este mismo deberá permitir la </w:t>
-      </w:r>
-      <w:proofErr w:type="spellStart"/>
-      <w:r>
-        <w:t>reejecución</w:t>
-      </w:r>
-      <w:proofErr w:type="spellEnd"/>
-      <w:r>
-        <w:t xml:space="preserve"> del proceso una vez restablecidos los servicios, evitando duplicidad de envíos.</w:t>
+        <w:t>este mismo deberá permitir la reejecución del proceso una vez restablecidos los servicios, evitando duplicidad de envíos.</w:t>
       </w:r>
       <w:r>
         <w:rPr>
@@ -8344,15 +7727,7 @@
               <w:t>Se</w:t>
             </w:r>
             <w:r>
-              <w:t xml:space="preserve"> registra el error y permite la </w:t>
-            </w:r>
-            <w:proofErr w:type="spellStart"/>
-            <w:r>
-              <w:t>reejecución</w:t>
-            </w:r>
-            <w:proofErr w:type="spellEnd"/>
-            <w:r>
-              <w:t xml:space="preserve"> una vez restablecido el servicio.</w:t>
+              <w:t xml:space="preserve"> registra el error y permite la reejecución una vez restablecido el servicio.</w:t>
             </w:r>
           </w:p>
         </w:tc>
@@ -8527,13 +7902,8 @@
               <w:t>a</w:t>
             </w:r>
             <w:r>
-              <w:t xml:space="preserve"> un error inesperado del </w:t>
-            </w:r>
-            <w:proofErr w:type="spellStart"/>
-            <w:r>
-              <w:t>bot</w:t>
-            </w:r>
-            <w:proofErr w:type="spellEnd"/>
+              <w:t xml:space="preserve"> un error inesperado del bot</w:t>
+            </w:r>
             <w:r>
               <w:t>, ¿qué medidas se tomarían?</w:t>
             </w:r>

</xml_diff>